<commit_message>
docs: cite the Zenodo concept DOI instead of a specific version DOI
Referencing a specific version DOI in the manuscript's Data
Availability statement is inherently self-referential: any edit to
that text changes the archived manuscript file, which would require
yet another Zenodo version, whose DOI the text could never actually
name in advance. Switches to the concept DOI
(10.5281/zenodo.20740375), which always resolves to the latest
version, avoiding this loop entirely. No new Zenodo release is cut for
this change; CITATION.cff.draft is left pointing at the current
v2.0.2 version DOI, which remains valid.

Co-Authored-By: Claude Sonnet 5 <noreply@anthropic.com>
</commit_message>
<xml_diff>
--- a/04_Manuscripts/major_revision/final/manuscript_main_IJB_major_revision_marked.docx
+++ b/04_Manuscripts/major_revision/final/manuscript_main_IJB_major_revision_marked.docx
@@ -3593,21 +3593,18 @@
         </w:r>
       </w:ins>
       <w:r>
-        <w:t>) and archived on Zenodo</w:t>
+        <w:t>) and archived on Zenodo (https://doi.org/10.5281/zenodo.20740375</w:t>
       </w:r>
       <w:del w:id="406" w:author="Author">
         <w:r>
-          <w:delText xml:space="preserve"> (</w:delText>
+          <w:delText>).</w:delText>
         </w:r>
       </w:del>
       <w:ins w:id="407" w:author="Author">
         <w:r>
-          <w:t xml:space="preserve">; this revision corresponds to Zenodo version DOI https://doi.org/10.5281/zenodo.21739583 (concept DOI: </w:t>
-        </w:r>
-      </w:ins>
-      <w:r>
-        <w:t>https://doi.org/10.5281/zenodo.20740375).</w:t>
-      </w:r>
+          <w:t>), which always resolves to the most recent version.</w:t>
+        </w:r>
+      </w:ins>
     </w:p>
     <w:p>
       <w:pPr>
@@ -5788,8 +5785,8 @@
                 <w:ins w:id="560" w:author="Author"/>
               </w:rPr>
             </w:pPr>
-            <w:moveToRangeStart w:id="561" w:author="Author" w:name="move236513838"/>
-            <w:moveTo w:id="562" w:author="Author" w16du:dateUtc="2026-08-01T12:57:00Z">
+            <w:moveToRangeStart w:id="561" w:author="Author" w:name="move236514860"/>
+            <w:moveTo w:id="562" w:author="Author" w16du:dateUtc="2026-08-01T13:14:00Z">
               <w:r>
                 <w:rPr>
                   <w:sz w:val="18"/>
@@ -5955,8 +5952,8 @@
                 <w:ins w:id="578" w:author="Author"/>
               </w:rPr>
             </w:pPr>
-            <w:moveToRangeStart w:id="579" w:author="Author" w:name="move236513839"/>
-            <w:moveTo w:id="580" w:author="Author" w16du:dateUtc="2026-08-01T12:57:00Z">
+            <w:moveToRangeStart w:id="579" w:author="Author" w:name="move236514861"/>
+            <w:moveTo w:id="580" w:author="Author" w16du:dateUtc="2026-08-01T13:14:00Z">
               <w:r>
                 <w:rPr>
                   <w:sz w:val="18"/>
@@ -6272,8 +6269,8 @@
                 <w:t>Days with maximum temperature ≥35°C (descriptive only)</w:t>
               </w:r>
             </w:ins>
-            <w:moveFromRangeStart w:id="612" w:author="Author" w:name="move236513838"/>
-            <w:moveFrom w:id="613" w:author="Author" w16du:dateUtc="2026-08-01T12:57:00Z">
+            <w:moveFromRangeStart w:id="612" w:author="Author" w:name="move236514860"/>
+            <w:moveFrom w:id="613" w:author="Author" w16du:dateUtc="2026-08-01T13:14:00Z">
               <w:r>
                 <w:rPr>
                   <w:sz w:val="18"/>
@@ -7501,8 +7498,8 @@
                 <w:t>94.</w:t>
               </w:r>
             </w:ins>
-            <w:moveFromRangeStart w:id="704" w:author="Author" w:name="move236513839"/>
-            <w:moveFrom w:id="705" w:author="Author" w16du:dateUtc="2026-08-01T12:57:00Z">
+            <w:moveFromRangeStart w:id="704" w:author="Author" w:name="move236514861"/>
+            <w:moveFrom w:id="705" w:author="Author" w16du:dateUtc="2026-08-01T13:14:00Z">
               <w:r>
                 <w:rPr>
                   <w:sz w:val="18"/>
@@ -9429,7 +9426,7 @@
             <w:noProof/>
           </w:rPr>
           <w:drawing>
-            <wp:inline distT="0" distB="0" distL="0" distR="0" wp14:anchorId="1E0EA0C7" wp14:editId="323AA997">
+            <wp:inline distT="0" distB="0" distL="0" distR="0" wp14:anchorId="5DC7F3B7" wp14:editId="5ADDA525">
               <wp:extent cx="5029200" cy="1954040"/>
               <wp:effectExtent l="0" t="0" r="0" b="0"/>
               <wp:docPr id="58" name="Picture"/>
@@ -9503,7 +9500,7 @@
             <w:noProof/>
           </w:rPr>
           <w:drawing>
-            <wp:inline distT="0" distB="0" distL="0" distR="0" wp14:anchorId="0F88E1A5" wp14:editId="11453DFA">
+            <wp:inline distT="0" distB="0" distL="0" distR="0" wp14:anchorId="04156B57" wp14:editId="44C3957D">
               <wp:extent cx="5029200" cy="3576427"/>
               <wp:effectExtent l="0" t="0" r="0" b="0"/>
               <wp:docPr id="62" name="Picture"/>
@@ -9560,7 +9557,7 @@
             <w:noProof/>
           </w:rPr>
           <w:drawing>
-            <wp:inline distT="0" distB="0" distL="0" distR="0" wp14:anchorId="668C49AF" wp14:editId="2EF3B856">
+            <wp:inline distT="0" distB="0" distL="0" distR="0" wp14:anchorId="0E746270" wp14:editId="21F10CA6">
               <wp:extent cx="5029200" cy="3771900"/>
               <wp:effectExtent l="0" t="0" r="0" b="0"/>
               <wp:docPr id="1" name="Picture 1"/>
@@ -9661,7 +9658,7 @@
             <w:noProof/>
           </w:rPr>
           <w:drawing>
-            <wp:inline distT="0" distB="0" distL="0" distR="0" wp14:anchorId="7C2EFA42" wp14:editId="3143C2B1">
+            <wp:inline distT="0" distB="0" distL="0" distR="0" wp14:anchorId="63896EC9" wp14:editId="2A6BF7A0">
               <wp:extent cx="5029200" cy="6353539"/>
               <wp:effectExtent l="0" t="0" r="0" b="0"/>
               <wp:docPr id="66" name="Picture"/>
@@ -10064,53 +10061,53 @@
 
 <file path=word/commentsExtended.xml><?xml version="1.0" encoding="utf-8"?>
 <w15:commentsEx xmlns:wpc="http://schemas.microsoft.com/office/word/2010/wordprocessingCanvas" xmlns:cx="http://schemas.microsoft.com/office/drawing/2014/chartex" xmlns:cx1="http://schemas.microsoft.com/office/drawing/2015/9/8/chartex" xmlns:cx2="http://schemas.microsoft.com/office/drawing/2015/10/21/chartex" xmlns:cx3="http://schemas.microsoft.com/office/drawing/2016/5/9/chartex" xmlns:cx4="http://schemas.microsoft.com/office/drawing/2016/5/10/chartex" xmlns:cx5="http://schemas.microsoft.com/office/drawing/2016/5/11/chartex" xmlns:cx6="http://schemas.microsoft.com/office/drawing/2016/5/12/chartex" xmlns:cx7="http://schemas.microsoft.com/office/drawing/2016/5/13/chartex" xmlns:cx8="http://schemas.microsoft.com/office/drawing/2016/5/14/chartex" xmlns:mc="http://schemas.openxmlformats.org/markup-compatibility/2006" xmlns:aink="http://schemas.microsoft.com/office/drawing/2016/ink" xmlns:am3d="http://schemas.microsoft.com/office/drawing/2017/model3d" xmlns:o="urn:schemas-microsoft-com:office:office" xmlns:oel="http://schemas.microsoft.com/office/2019/extlst" xmlns:r="http://schemas.openxmlformats.org/officeDocument/2006/relationships" xmlns:m="http://schemas.openxmlformats.org/officeDocument/2006/math" xmlns:v="urn:schemas-microsoft-com:vml" xmlns:wp14="http://schemas.microsoft.com/office/word/2010/wordprocessingDrawing" xmlns:wp="http://schemas.openxmlformats.org/drawingml/2006/wordprocessingDrawing" xmlns:w10="urn:schemas-microsoft-com:office:word" xmlns:w="http://schemas.openxmlformats.org/wordprocessingml/2006/main" xmlns:w14="http://schemas.microsoft.com/office/word/2010/wordml" xmlns:w15="http://schemas.microsoft.com/office/word/2012/wordml" xmlns:w16cex="http://schemas.microsoft.com/office/word/2018/wordml/cex" xmlns:w16cid="http://schemas.microsoft.com/office/word/2016/wordml/cid" xmlns:w16="http://schemas.microsoft.com/office/word/2018/wordml" xmlns:w16du="http://schemas.microsoft.com/office/word/2023/wordml/word16du" xmlns:w16sdtdh="http://schemas.microsoft.com/office/word/2020/wordml/sdtdatahash" xmlns:w16sdtfl="http://schemas.microsoft.com/office/word/2024/wordml/sdtformatlock" xmlns:w16se="http://schemas.microsoft.com/office/word/2015/wordml/symex" xmlns:wpg="http://schemas.microsoft.com/office/word/2010/wordprocessingGroup" xmlns:wpi="http://schemas.microsoft.com/office/word/2010/wordprocessingInk" xmlns:wne="http://schemas.microsoft.com/office/word/2006/wordml" xmlns:wps="http://schemas.microsoft.com/office/word/2010/wordprocessingShape" mc:Ignorable="w14 w15 w16se w16cid w16 w16cex w16sdtdh w16sdtfl w16du wp14">
-  <w15:commentEx w15:paraId="435EC4C0" w15:done="0"/>
-  <w15:commentEx w15:paraId="385B3A9F" w15:done="0"/>
-  <w15:commentEx w15:paraId="6EFC5B1D" w15:done="0"/>
-  <w15:commentEx w15:paraId="595A6C1E" w15:done="0"/>
-  <w15:commentEx w15:paraId="5A3EE6DD" w15:done="0"/>
-  <w15:commentEx w15:paraId="3A2B9410" w15:done="0"/>
-  <w15:commentEx w15:paraId="34DBF33E" w15:done="0"/>
-  <w15:commentEx w15:paraId="45B0299B" w15:done="0"/>
-  <w15:commentEx w15:paraId="1238FD0C" w15:done="0"/>
-  <w15:commentEx w15:paraId="0D81BFEA" w15:done="0"/>
-  <w15:commentEx w15:paraId="45AC1C52" w15:done="0"/>
-  <w15:commentEx w15:paraId="76C75BFD" w15:done="0"/>
-  <w15:commentEx w15:paraId="34352136" w15:done="0"/>
-  <w15:commentEx w15:paraId="5FC05439" w15:done="0"/>
-  <w15:commentEx w15:paraId="6BD109FA" w15:done="0"/>
-  <w15:commentEx w15:paraId="11F091E0" w15:done="0"/>
-  <w15:commentEx w15:paraId="14B4895B" w15:done="0"/>
-  <w15:commentEx w15:paraId="07086844" w15:done="0"/>
-  <w15:commentEx w15:paraId="78876678" w15:done="0"/>
-  <w15:commentEx w15:paraId="3C0040E3" w15:done="0"/>
-  <w15:commentEx w15:paraId="70C61024" w15:done="0"/>
+  <w15:commentEx w15:paraId="4F510F2E" w15:done="0"/>
+  <w15:commentEx w15:paraId="5D3AB240" w15:done="0"/>
+  <w15:commentEx w15:paraId="60CD7122" w15:done="0"/>
+  <w15:commentEx w15:paraId="1AC0A420" w15:done="0"/>
+  <w15:commentEx w15:paraId="15E1430E" w15:done="0"/>
+  <w15:commentEx w15:paraId="7DD63AF0" w15:done="0"/>
+  <w15:commentEx w15:paraId="1E9FF4A3" w15:done="0"/>
+  <w15:commentEx w15:paraId="2F099652" w15:done="0"/>
+  <w15:commentEx w15:paraId="1DD88C47" w15:done="0"/>
+  <w15:commentEx w15:paraId="62C845F9" w15:done="0"/>
+  <w15:commentEx w15:paraId="383156B8" w15:done="0"/>
+  <w15:commentEx w15:paraId="57D8B4F2" w15:done="0"/>
+  <w15:commentEx w15:paraId="48CF429B" w15:done="0"/>
+  <w15:commentEx w15:paraId="3E137F8E" w15:done="0"/>
+  <w15:commentEx w15:paraId="19ABFAF6" w15:done="0"/>
+  <w15:commentEx w15:paraId="39D9C4B4" w15:done="0"/>
+  <w15:commentEx w15:paraId="197698EF" w15:done="0"/>
+  <w15:commentEx w15:paraId="0C41DA95" w15:done="0"/>
+  <w15:commentEx w15:paraId="18D154D9" w15:done="0"/>
+  <w15:commentEx w15:paraId="0771E664" w15:done="0"/>
+  <w15:commentEx w15:paraId="37A034AA" w15:done="0"/>
 </w15:commentsEx>
 </file>
 
 <file path=word/commentsIds.xml><?xml version="1.0" encoding="utf-8"?>
 <w16cid:commentsIds xmlns:wpc="http://schemas.microsoft.com/office/word/2010/wordprocessingCanvas" xmlns:cx="http://schemas.microsoft.com/office/drawing/2014/chartex" xmlns:cx1="http://schemas.microsoft.com/office/drawing/2015/9/8/chartex" xmlns:cx2="http://schemas.microsoft.com/office/drawing/2015/10/21/chartex" xmlns:cx3="http://schemas.microsoft.com/office/drawing/2016/5/9/chartex" xmlns:cx4="http://schemas.microsoft.com/office/drawing/2016/5/10/chartex" xmlns:cx5="http://schemas.microsoft.com/office/drawing/2016/5/11/chartex" xmlns:cx6="http://schemas.microsoft.com/office/drawing/2016/5/12/chartex" xmlns:cx7="http://schemas.microsoft.com/office/drawing/2016/5/13/chartex" xmlns:cx8="http://schemas.microsoft.com/office/drawing/2016/5/14/chartex" xmlns:mc="http://schemas.openxmlformats.org/markup-compatibility/2006" xmlns:aink="http://schemas.microsoft.com/office/drawing/2016/ink" xmlns:am3d="http://schemas.microsoft.com/office/drawing/2017/model3d" xmlns:o="urn:schemas-microsoft-com:office:office" xmlns:oel="http://schemas.microsoft.com/office/2019/extlst" xmlns:r="http://schemas.openxmlformats.org/officeDocument/2006/relationships" xmlns:m="http://schemas.openxmlformats.org/officeDocument/2006/math" xmlns:v="urn:schemas-microsoft-com:vml" xmlns:wp14="http://schemas.microsoft.com/office/word/2010/wordprocessingDrawing" xmlns:wp="http://schemas.openxmlformats.org/drawingml/2006/wordprocessingDrawing" xmlns:w10="urn:schemas-microsoft-com:office:word" xmlns:w="http://schemas.openxmlformats.org/wordprocessingml/2006/main" xmlns:w14="http://schemas.microsoft.com/office/word/2010/wordml" xmlns:w15="http://schemas.microsoft.com/office/word/2012/wordml" xmlns:w16cex="http://schemas.microsoft.com/office/word/2018/wordml/cex" xmlns:w16cid="http://schemas.microsoft.com/office/word/2016/wordml/cid" xmlns:w16="http://schemas.microsoft.com/office/word/2018/wordml" xmlns:w16du="http://schemas.microsoft.com/office/word/2023/wordml/word16du" xmlns:w16sdtdh="http://schemas.microsoft.com/office/word/2020/wordml/sdtdatahash" xmlns:w16sdtfl="http://schemas.microsoft.com/office/word/2024/wordml/sdtformatlock" xmlns:w16se="http://schemas.microsoft.com/office/word/2015/wordml/symex" xmlns:wpg="http://schemas.microsoft.com/office/word/2010/wordprocessingGroup" xmlns:wpi="http://schemas.microsoft.com/office/word/2010/wordprocessingInk" xmlns:wne="http://schemas.microsoft.com/office/word/2006/wordml" xmlns:wps="http://schemas.microsoft.com/office/word/2010/wordprocessingShape" mc:Ignorable="w14 w15 w16se w16cid w16 w16cex w16sdtdh w16sdtfl w16du wp14">
-  <w16cid:commentId w16cid:paraId="435EC4C0" w16cid:durableId="505EE13B"/>
-  <w16cid:commentId w16cid:paraId="385B3A9F" w16cid:durableId="29AAF53E"/>
-  <w16cid:commentId w16cid:paraId="6EFC5B1D" w16cid:durableId="456945FD"/>
-  <w16cid:commentId w16cid:paraId="595A6C1E" w16cid:durableId="4FC16EAE"/>
-  <w16cid:commentId w16cid:paraId="5A3EE6DD" w16cid:durableId="70D44CB7"/>
-  <w16cid:commentId w16cid:paraId="3A2B9410" w16cid:durableId="573CB48A"/>
-  <w16cid:commentId w16cid:paraId="34DBF33E" w16cid:durableId="22D7B112"/>
-  <w16cid:commentId w16cid:paraId="45B0299B" w16cid:durableId="455B4185"/>
-  <w16cid:commentId w16cid:paraId="1238FD0C" w16cid:durableId="6CED0133"/>
-  <w16cid:commentId w16cid:paraId="0D81BFEA" w16cid:durableId="0E20AFB7"/>
-  <w16cid:commentId w16cid:paraId="45AC1C52" w16cid:durableId="1AFBDEDA"/>
-  <w16cid:commentId w16cid:paraId="76C75BFD" w16cid:durableId="6D495CAF"/>
-  <w16cid:commentId w16cid:paraId="34352136" w16cid:durableId="729AB7DF"/>
-  <w16cid:commentId w16cid:paraId="5FC05439" w16cid:durableId="27BF6F16"/>
-  <w16cid:commentId w16cid:paraId="6BD109FA" w16cid:durableId="66D0ED8B"/>
-  <w16cid:commentId w16cid:paraId="11F091E0" w16cid:durableId="76C39061"/>
-  <w16cid:commentId w16cid:paraId="14B4895B" w16cid:durableId="03A7D176"/>
-  <w16cid:commentId w16cid:paraId="07086844" w16cid:durableId="652B2A98"/>
-  <w16cid:commentId w16cid:paraId="78876678" w16cid:durableId="65B8E0A6"/>
-  <w16cid:commentId w16cid:paraId="3C0040E3" w16cid:durableId="7CE2A6A3"/>
-  <w16cid:commentId w16cid:paraId="70C61024" w16cid:durableId="61EED3CF"/>
+  <w16cid:commentId w16cid:paraId="4F510F2E" w16cid:durableId="505EE13B"/>
+  <w16cid:commentId w16cid:paraId="5D3AB240" w16cid:durableId="29AAF53E"/>
+  <w16cid:commentId w16cid:paraId="60CD7122" w16cid:durableId="456945FD"/>
+  <w16cid:commentId w16cid:paraId="1AC0A420" w16cid:durableId="4FC16EAE"/>
+  <w16cid:commentId w16cid:paraId="15E1430E" w16cid:durableId="70D44CB7"/>
+  <w16cid:commentId w16cid:paraId="7DD63AF0" w16cid:durableId="573CB48A"/>
+  <w16cid:commentId w16cid:paraId="1E9FF4A3" w16cid:durableId="22D7B112"/>
+  <w16cid:commentId w16cid:paraId="2F099652" w16cid:durableId="455B4185"/>
+  <w16cid:commentId w16cid:paraId="1DD88C47" w16cid:durableId="6CED0133"/>
+  <w16cid:commentId w16cid:paraId="62C845F9" w16cid:durableId="0E20AFB7"/>
+  <w16cid:commentId w16cid:paraId="383156B8" w16cid:durableId="1AFBDEDA"/>
+  <w16cid:commentId w16cid:paraId="57D8B4F2" w16cid:durableId="6D495CAF"/>
+  <w16cid:commentId w16cid:paraId="48CF429B" w16cid:durableId="729AB7DF"/>
+  <w16cid:commentId w16cid:paraId="3E137F8E" w16cid:durableId="27BF6F16"/>
+  <w16cid:commentId w16cid:paraId="19ABFAF6" w16cid:durableId="66D0ED8B"/>
+  <w16cid:commentId w16cid:paraId="39D9C4B4" w16cid:durableId="76C39061"/>
+  <w16cid:commentId w16cid:paraId="197698EF" w16cid:durableId="03A7D176"/>
+  <w16cid:commentId w16cid:paraId="0C41DA95" w16cid:durableId="652B2A98"/>
+  <w16cid:commentId w16cid:paraId="18D154D9" w16cid:durableId="65B8E0A6"/>
+  <w16cid:commentId w16cid:paraId="0771E664" w16cid:durableId="7CE2A6A3"/>
+  <w16cid:commentId w16cid:paraId="37A034AA" w16cid:durableId="61EED3CF"/>
 </w16cid:commentsIds>
 </file>
 
@@ -11932,7 +11929,7 @@
   <w:style w:type="paragraph" w:styleId="afb">
     <w:name w:val="Revision"/>
     <w:hidden/>
-    <w:rsid w:val="007F5C0C"/>
+    <w:rsid w:val="00F8425D"/>
     <w:pPr>
       <w:spacing w:after="0"/>
     </w:pPr>

</xml_diff>

<commit_message>
fix: correct wrong Zenodo concept DOI (20740375 -> 20740374)
10.5281/zenodo.20740375, used throughout the manuscript, README,
REPRODUCE.md, and CITATION.cff.draft as "the concept DOI which always
resolves to the most recent version," is actually the version-specific
DOI for v1.0.0 -- it does not redirect to latest. The real concept DOI
is one lower, 10.5281/zenodo.20740374 (confirmed by resolving both
through doi.org: .375 lands on the frozen v1.0.0 record, .374 lands on
the current latest version). The manuscript's own claim that its cited
DOI "always resolves to the most recent version" was therefore false
for the DOI actually printed. Corrects all four occurrences.

Co-Authored-By: Claude Sonnet 5 <noreply@anthropic.com>
</commit_message>
<xml_diff>
--- a/04_Manuscripts/major_revision/final/manuscript_main_IJB_major_revision_marked.docx
+++ b/04_Manuscripts/major_revision/final/manuscript_main_IJB_major_revision_marked.docx
@@ -3523,16 +3523,16 @@
         </w:r>
       </w:ins>
       <w:r>
-        <w:t>) and archived on Zenodo (https://doi.org/10.5281/zenodo.20740375</w:t>
+        <w:t>) and archived on Zenodo (https://doi.org/10.5281/zenodo.</w:t>
       </w:r>
       <w:del w:id="406" w:author="Author">
         <w:r>
-          <w:delText>).</w:delText>
+          <w:delText>20740375).</w:delText>
         </w:r>
       </w:del>
       <w:ins w:id="407" w:author="Author">
         <w:r>
-          <w:t>), which always resolves to the most recent version.</w:t>
+          <w:t>20740374), which always resolves to the most recent version.</w:t>
         </w:r>
       </w:ins>
     </w:p>
@@ -5715,8 +5715,8 @@
                 <w:ins w:id="560" w:author="Author"/>
               </w:rPr>
             </w:pPr>
-            <w:moveToRangeStart w:id="561" w:author="Author" w:name="move236558136"/>
-            <w:moveTo w:id="562" w:author="Author" w16du:dateUtc="2026-08-02T01:15:00Z">
+            <w:moveToRangeStart w:id="561" w:author="Author" w:name="move236559399"/>
+            <w:moveTo w:id="562" w:author="Author" w16du:dateUtc="2026-08-02T01:36:00Z">
               <w:r>
                 <w:rPr>
                   <w:sz w:val="18"/>
@@ -5882,8 +5882,8 @@
                 <w:ins w:id="578" w:author="Author"/>
               </w:rPr>
             </w:pPr>
-            <w:moveToRangeStart w:id="579" w:author="Author" w:name="move236558137"/>
-            <w:moveTo w:id="580" w:author="Author" w16du:dateUtc="2026-08-02T01:15:00Z">
+            <w:moveToRangeStart w:id="579" w:author="Author" w:name="move236559400"/>
+            <w:moveTo w:id="580" w:author="Author" w16du:dateUtc="2026-08-02T01:36:00Z">
               <w:r>
                 <w:rPr>
                   <w:sz w:val="18"/>
@@ -6199,8 +6199,8 @@
                 <w:t>Days with maximum temperature ≥35°C (descriptive only)</w:t>
               </w:r>
             </w:ins>
-            <w:moveFromRangeStart w:id="612" w:author="Author" w:name="move236558136"/>
-            <w:moveFrom w:id="613" w:author="Author" w16du:dateUtc="2026-08-02T01:15:00Z">
+            <w:moveFromRangeStart w:id="612" w:author="Author" w:name="move236559399"/>
+            <w:moveFrom w:id="613" w:author="Author" w16du:dateUtc="2026-08-02T01:36:00Z">
               <w:r>
                 <w:rPr>
                   <w:sz w:val="18"/>
@@ -6800,7 +6800,7 @@
         <w:tc>
           <w:tcPr>
             <w:tcW w:w="1800" w:type="dxa"/>
-            <w:cellIns w:id="646" w:author="Author" w:date="1900-00-00T00:01:00Z"/>
+            <w:cellIns w:id="646" w:author="Author"/>
           </w:tcPr>
           <w:p>
             <w:ins w:id="647" w:author="Author">
@@ -6817,7 +6817,7 @@
         <w:tc>
           <w:tcPr>
             <w:tcW w:w="432" w:type="dxa"/>
-            <w:cellIns w:id="648" w:author="Author" w:date="1900-00-00T00:01:00Z"/>
+            <w:cellIns w:id="648" w:author="Author"/>
           </w:tcPr>
           <w:p>
             <w:ins w:id="649" w:author="Author">
@@ -6874,7 +6874,7 @@
         <w:tc>
           <w:tcPr>
             <w:tcW w:w="1368" w:type="dxa"/>
-            <w:cellIns w:id="652" w:author="Author" w:date="1900-00-00T00:01:00Z"/>
+            <w:cellIns w:id="652" w:author="Author"/>
           </w:tcPr>
           <w:p>
             <w:ins w:id="653" w:author="Author">
@@ -6960,7 +6960,7 @@
         <w:tc>
           <w:tcPr>
             <w:tcW w:w="720" w:type="dxa"/>
-            <w:cellIns w:id="657" w:author="Author" w:date="1900-00-00T00:01:00Z"/>
+            <w:cellIns w:id="657" w:author="Author"/>
           </w:tcPr>
           <w:p>
             <w:ins w:id="658" w:author="Author">
@@ -7027,7 +7027,7 @@
         <w:tc>
           <w:tcPr>
             <w:tcW w:w="432" w:type="dxa"/>
-            <w:cellIns w:id="663" w:author="Author" w:date="1900-00-00T00:01:00Z"/>
+            <w:cellIns w:id="663" w:author="Author"/>
           </w:tcPr>
           <w:p>
             <w:ins w:id="664" w:author="Author">
@@ -7044,7 +7044,7 @@
           <w:tcPr>
             <w:tcW w:w="1368" w:type="dxa"/>
             <w:gridSpan w:val="2"/>
-            <w:cellIns w:id="665" w:author="Author" w:date="1900-00-00T00:01:00Z"/>
+            <w:cellIns w:id="665" w:author="Author"/>
           </w:tcPr>
           <w:p>
             <w:ins w:id="666" w:author="Author">
@@ -7152,7 +7152,7 @@
         <w:tc>
           <w:tcPr>
             <w:tcW w:w="792" w:type="dxa"/>
-            <w:cellIns w:id="674" w:author="Author" w:date="1900-00-00T00:01:00Z"/>
+            <w:cellIns w:id="674" w:author="Author"/>
           </w:tcPr>
           <w:p>
             <w:ins w:id="675" w:author="Author">
@@ -7168,7 +7168,7 @@
         <w:tc>
           <w:tcPr>
             <w:tcW w:w="720" w:type="dxa"/>
-            <w:cellIns w:id="676" w:author="Author" w:date="1900-00-00T00:01:00Z"/>
+            <w:cellIns w:id="676" w:author="Author"/>
           </w:tcPr>
           <w:p>
             <w:ins w:id="677" w:author="Author">
@@ -7226,7 +7226,7 @@
         <w:tc>
           <w:tcPr>
             <w:tcW w:w="432" w:type="dxa"/>
-            <w:cellIns w:id="682" w:author="Author" w:date="1900-00-00T00:01:00Z"/>
+            <w:cellIns w:id="682" w:author="Author"/>
           </w:tcPr>
           <w:p>
             <w:ins w:id="683" w:author="Author">
@@ -7243,7 +7243,7 @@
           <w:tcPr>
             <w:tcW w:w="1368" w:type="dxa"/>
             <w:gridSpan w:val="2"/>
-            <w:cellIns w:id="684" w:author="Author" w:date="1900-00-00T00:01:00Z"/>
+            <w:cellIns w:id="684" w:author="Author"/>
           </w:tcPr>
           <w:p>
             <w:ins w:id="685" w:author="Author">
@@ -7331,7 +7331,7 @@
         <w:tc>
           <w:tcPr>
             <w:tcW w:w="792" w:type="dxa"/>
-            <w:cellIns w:id="692" w:author="Author" w:date="1900-00-00T00:01:00Z"/>
+            <w:cellIns w:id="692" w:author="Author"/>
           </w:tcPr>
           <w:p>
             <w:ins w:id="693" w:author="Author">
@@ -7347,7 +7347,7 @@
         <w:tc>
           <w:tcPr>
             <w:tcW w:w="720" w:type="dxa"/>
-            <w:cellIns w:id="694" w:author="Author" w:date="1900-00-00T00:01:00Z"/>
+            <w:cellIns w:id="694" w:author="Author"/>
           </w:tcPr>
           <w:p>
             <w:ins w:id="695" w:author="Author">
@@ -7365,7 +7365,7 @@
         <w:tc>
           <w:tcPr>
             <w:tcW w:w="792" w:type="dxa"/>
-            <w:cellIns w:id="696" w:author="Author" w:date="1900-00-00T00:01:00Z"/>
+            <w:cellIns w:id="696" w:author="Author"/>
           </w:tcPr>
           <w:p>
             <w:ins w:id="697" w:author="Author">
@@ -7381,7 +7381,7 @@
         <w:tc>
           <w:tcPr>
             <w:tcW w:w="1800" w:type="dxa"/>
-            <w:cellIns w:id="698" w:author="Author" w:date="1900-00-00T00:01:00Z"/>
+            <w:cellIns w:id="698" w:author="Author"/>
           </w:tcPr>
           <w:p>
             <w:ins w:id="699" w:author="Author">
@@ -7397,7 +7397,7 @@
         <w:tc>
           <w:tcPr>
             <w:tcW w:w="432" w:type="dxa"/>
-            <w:cellIns w:id="700" w:author="Author" w:date="1900-00-00T00:01:00Z"/>
+            <w:cellIns w:id="700" w:author="Author"/>
           </w:tcPr>
           <w:p>
             <w:ins w:id="701" w:author="Author">
@@ -7428,8 +7428,8 @@
                 <w:t>94.</w:t>
               </w:r>
             </w:ins>
-            <w:moveFromRangeStart w:id="704" w:author="Author" w:name="move236558137"/>
-            <w:moveFrom w:id="705" w:author="Author" w16du:dateUtc="2026-08-02T01:15:00Z">
+            <w:moveFromRangeStart w:id="704" w:author="Author" w:name="move236559400"/>
+            <w:moveFrom w:id="705" w:author="Author" w16du:dateUtc="2026-08-02T01:36:00Z">
               <w:r>
                 <w:rPr>
                   <w:sz w:val="18"/>
@@ -7473,7 +7473,7 @@
         <w:tc>
           <w:tcPr>
             <w:tcW w:w="1584" w:type="dxa"/>
-            <w:cellDel w:id="709" w:author="Author" w:date="1900-00-00T00:01:00Z"/>
+            <w:cellDel w:id="709" w:author="Author"/>
           </w:tcPr>
           <w:p>
             <w:pPr>
@@ -7569,7 +7569,7 @@
         <w:tc>
           <w:tcPr>
             <w:tcW w:w="792" w:type="dxa"/>
-            <w:cellIns w:id="717" w:author="Author" w:date="1900-00-00T00:01:00Z"/>
+            <w:cellIns w:id="717" w:author="Author"/>
           </w:tcPr>
           <w:p>
             <w:ins w:id="718" w:author="Author">
@@ -7585,7 +7585,7 @@
         <w:tc>
           <w:tcPr>
             <w:tcW w:w="720" w:type="dxa"/>
-            <w:cellIns w:id="719" w:author="Author" w:date="1900-00-00T00:01:00Z"/>
+            <w:cellIns w:id="719" w:author="Author"/>
           </w:tcPr>
           <w:p>
             <w:ins w:id="720" w:author="Author">
@@ -7603,7 +7603,7 @@
         <w:tc>
           <w:tcPr>
             <w:tcW w:w="792" w:type="dxa"/>
-            <w:cellIns w:id="721" w:author="Author" w:date="1900-00-00T00:01:00Z"/>
+            <w:cellIns w:id="721" w:author="Author"/>
           </w:tcPr>
           <w:p>
             <w:ins w:id="722" w:author="Author">
@@ -7660,7 +7660,7 @@
           <w:tcPr>
             <w:tcW w:w="1368" w:type="dxa"/>
             <w:gridSpan w:val="2"/>
-            <w:cellIns w:id="727" w:author="Author" w:date="1900-00-00T00:01:00Z"/>
+            <w:cellIns w:id="727" w:author="Author"/>
           </w:tcPr>
           <w:p>
             <w:ins w:id="728" w:author="Author">
@@ -7696,7 +7696,7 @@
         <w:tc>
           <w:tcPr>
             <w:tcW w:w="648" w:type="dxa"/>
-            <w:cellIns w:id="731" w:author="Author" w:date="1900-00-00T00:01:00Z"/>
+            <w:cellIns w:id="731" w:author="Author"/>
           </w:tcPr>
           <w:p>
             <w:ins w:id="732" w:author="Author">
@@ -7764,7 +7764,7 @@
         <w:tc>
           <w:tcPr>
             <w:tcW w:w="720" w:type="dxa"/>
-            <w:cellIns w:id="737" w:author="Author" w:date="1900-00-00T00:01:00Z"/>
+            <w:cellIns w:id="737" w:author="Author"/>
           </w:tcPr>
           <w:p>
             <w:ins w:id="738" w:author="Author">
@@ -9356,7 +9356,7 @@
             <w:noProof/>
           </w:rPr>
           <w:drawing>
-            <wp:inline distT="0" distB="0" distL="0" distR="0" wp14:anchorId="0B15B47A" wp14:editId="5AB95A1A">
+            <wp:inline distT="0" distB="0" distL="0" distR="0" wp14:anchorId="74A70585" wp14:editId="468BBB3F">
               <wp:extent cx="5029200" cy="1954040"/>
               <wp:effectExtent l="0" t="0" r="0" b="0"/>
               <wp:docPr id="58" name="Picture"/>
@@ -9430,7 +9430,7 @@
             <w:noProof/>
           </w:rPr>
           <w:drawing>
-            <wp:inline distT="0" distB="0" distL="0" distR="0" wp14:anchorId="13C2709D" wp14:editId="2566F05B">
+            <wp:inline distT="0" distB="0" distL="0" distR="0" wp14:anchorId="799B4A82" wp14:editId="55864946">
               <wp:extent cx="5029200" cy="3576427"/>
               <wp:effectExtent l="0" t="0" r="0" b="0"/>
               <wp:docPr id="62" name="Picture"/>
@@ -9487,7 +9487,7 @@
             <w:noProof/>
           </w:rPr>
           <w:drawing>
-            <wp:inline distT="0" distB="0" distL="0" distR="0" wp14:anchorId="18DE0771" wp14:editId="18D028F5">
+            <wp:inline distT="0" distB="0" distL="0" distR="0" wp14:anchorId="4FB22FD6" wp14:editId="01E20840">
               <wp:extent cx="5029200" cy="3771900"/>
               <wp:effectExtent l="0" t="0" r="0" b="0"/>
               <wp:docPr id="1" name="Picture 1"/>
@@ -9587,7 +9587,7 @@
             <w:noProof/>
           </w:rPr>
           <w:drawing>
-            <wp:inline distT="0" distB="0" distL="0" distR="0" wp14:anchorId="4FAA3E65" wp14:editId="512879D7">
+            <wp:inline distT="0" distB="0" distL="0" distR="0" wp14:anchorId="407B956C" wp14:editId="602038D5">
               <wp:extent cx="5029200" cy="6353539"/>
               <wp:effectExtent l="0" t="0" r="0" b="0"/>
               <wp:docPr id="66" name="Picture"/>
@@ -11464,7 +11464,7 @@
   <w:style w:type="paragraph" w:styleId="afb">
     <w:name w:val="Revision"/>
     <w:hidden/>
-    <w:rsid w:val="002E3BB5"/>
+    <w:rsid w:val="007F0EC5"/>
     <w:pPr>
       <w:spacing w:after="0"/>
     </w:pPr>

</xml_diff>